<commit_message>
feat: govern analytics travel changes and onboarding
</commit_message>
<xml_diff>
--- a/docs/data-model/SMF_Travel_Modello_Logico_Dati_v1.0.docx
+++ b/docs/data-model/SMF_Travel_Modello_Logico_Dati_v1.0.docx
@@ -10428,6 +10428,696 @@
           <w:i/>
         </w:rPr>
         <w:t>Nota: DAMA-DMBOK e un framework di buone pratiche, non una certificazione automatica del modello. Le scelte specifiche restano motivate e verificabili nel presente elaborato.</w:t>
+      </w:r>
+    </w:p>
+    <w:p>
+      <w:r>
+        <w:br w:type="page"/>
+      </w:r>
+    </w:p>
+    <w:p>
+      <w:pPr>
+        <w:pStyle w:val="Heading1"/>
+        <w:keepNext/>
+      </w:pPr>
+      <w:r>
+        <w:t>Aggiornamento Analytics per l'agenzia</w:t>
+      </w:r>
+    </w:p>
+    <w:p>
+      <w:r>
+        <w:t>Questa appendice recepisce la funzionalita Analytics introdotta nel pannello agenzia. La soluzione misura l'adozione e l'utilizzo del servizio senza mostrare all'agenzia il dettaglio personale delle azioni del singolo viaggiatore.</w:t>
+      </w:r>
+    </w:p>
+    <w:p>
+      <w:pPr>
+        <w:pStyle w:val="Heading2"/>
+        <w:keepNext/>
+      </w:pPr>
+      <w:r>
+        <w:t>Estensione del modello concettuale</w:t>
+      </w:r>
+    </w:p>
+    <w:tbl>
+      <w:tblPr>
+        <w:tblStyle w:val="TableGrid"/>
+        <w:tblW w:type="auto" w:w="0"/>
+        <w:tblLayout w:type="fixed"/>
+        <w:tblLook w:firstColumn="1" w:firstRow="1" w:lastColumn="0" w:lastRow="0" w:noHBand="0" w:noVBand="1" w:val="04A0"/>
+      </w:tblPr>
+      <w:tblGrid>
+        <w:gridCol w:w="3120"/>
+        <w:gridCol w:w="3120"/>
+        <w:gridCol w:w="3120"/>
+      </w:tblGrid>
+      <w:tr>
+        <w:trPr>
+          <w:tblHeader/>
+        </w:trPr>
+        <w:tc>
+          <w:tcPr>
+            <w:tcW w:type="dxa" w:w="1944"/>
+            <w:vAlign w:val="center"/>
+          </w:tcPr>
+          <w:p>
+            <w:r>
+              <w:rPr>
+                <w:b/>
+                <w:sz w:val="18"/>
+              </w:rPr>
+              <w:t>Entita</w:t>
+            </w:r>
+          </w:p>
+        </w:tc>
+        <w:tc>
+          <w:tcPr>
+            <w:tcW w:type="dxa" w:w="3960"/>
+            <w:vAlign w:val="center"/>
+          </w:tcPr>
+          <w:p>
+            <w:r>
+              <w:rPr>
+                <w:b/>
+                <w:sz w:val="18"/>
+              </w:rPr>
+              <w:t>Scopo</w:t>
+            </w:r>
+          </w:p>
+        </w:tc>
+        <w:tc>
+          <w:tcPr>
+            <w:tcW w:type="dxa" w:w="3456"/>
+            <w:vAlign w:val="center"/>
+          </w:tcPr>
+          <w:p>
+            <w:r>
+              <w:rPr>
+                <w:b/>
+                <w:sz w:val="18"/>
+              </w:rPr>
+              <w:t>Relazioni principali</w:t>
+            </w:r>
+          </w:p>
+        </w:tc>
+      </w:tr>
+      <w:tr>
+        <w:tc>
+          <w:tcPr>
+            <w:tcW w:type="dxa" w:w="1944"/>
+            <w:vAlign w:val="center"/>
+          </w:tcPr>
+          <w:p>
+            <w:pPr>
+              <w:spacing w:after="40"/>
+            </w:pPr>
+            <w:r>
+              <w:rPr>
+                <w:sz w:val="17"/>
+              </w:rPr>
+              <w:t>Evento Analytics</w:t>
+            </w:r>
+          </w:p>
+        </w:tc>
+        <w:tc>
+          <w:tcPr>
+            <w:tcW w:type="dxa" w:w="3960"/>
+            <w:vAlign w:val="center"/>
+          </w:tcPr>
+          <w:p>
+            <w:pPr>
+              <w:spacing w:after="40"/>
+            </w:pPr>
+            <w:r>
+              <w:rPr>
+                <w:sz w:val="17"/>
+              </w:rPr>
+              <w:t>Fatto atomico prodotto dall'utilizzo dell'app viaggiatore.</w:t>
+            </w:r>
+          </w:p>
+        </w:tc>
+        <w:tc>
+          <w:tcPr>
+            <w:tcW w:type="dxa" w:w="3456"/>
+            <w:vAlign w:val="center"/>
+          </w:tcPr>
+          <w:p>
+            <w:pPr>
+              <w:spacing w:after="40"/>
+            </w:pPr>
+            <w:r>
+              <w:rPr>
+                <w:sz w:val="17"/>
+              </w:rPr>
+              <w:t>Agenzia, Utente, Viaggiatore, Partenza, Gruppo, Giornata</w:t>
+            </w:r>
+          </w:p>
+        </w:tc>
+      </w:tr>
+      <w:tr>
+        <w:tc>
+          <w:tcPr>
+            <w:tcW w:type="dxa" w:w="1944"/>
+            <w:vAlign w:val="center"/>
+          </w:tcPr>
+          <w:p>
+            <w:pPr>
+              <w:spacing w:after="40"/>
+            </w:pPr>
+            <w:r>
+              <w:rPr>
+                <w:sz w:val="17"/>
+              </w:rPr>
+              <w:t>Sessione Analytics</w:t>
+            </w:r>
+          </w:p>
+        </w:tc>
+        <w:tc>
+          <w:tcPr>
+            <w:tcW w:type="dxa" w:w="3960"/>
+            <w:vAlign w:val="center"/>
+          </w:tcPr>
+          <w:p>
+            <w:pPr>
+              <w:spacing w:after="40"/>
+            </w:pPr>
+            <w:r>
+              <w:rPr>
+                <w:sz w:val="17"/>
+              </w:rPr>
+              <w:t>Contesto client temporaneo usato per deduplicare consultazioni equivalenti.</w:t>
+            </w:r>
+          </w:p>
+        </w:tc>
+        <w:tc>
+          <w:tcPr>
+            <w:tcW w:type="dxa" w:w="3456"/>
+            <w:vAlign w:val="center"/>
+          </w:tcPr>
+          <w:p>
+            <w:pPr>
+              <w:spacing w:after="40"/>
+            </w:pPr>
+            <w:r>
+              <w:rPr>
+                <w:sz w:val="17"/>
+              </w:rPr>
+              <w:t>Utente e insieme di Eventi Analytics</w:t>
+            </w:r>
+          </w:p>
+        </w:tc>
+      </w:tr>
+      <w:tr>
+        <w:tc>
+          <w:tcPr>
+            <w:tcW w:type="dxa" w:w="1944"/>
+            <w:vAlign w:val="center"/>
+          </w:tcPr>
+          <w:p>
+            <w:pPr>
+              <w:spacing w:after="40"/>
+            </w:pPr>
+            <w:r>
+              <w:rPr>
+                <w:sz w:val="17"/>
+              </w:rPr>
+              <w:t>Indicatore Agenzia</w:t>
+            </w:r>
+          </w:p>
+        </w:tc>
+        <w:tc>
+          <w:tcPr>
+            <w:tcW w:type="dxa" w:w="3960"/>
+            <w:vAlign w:val="center"/>
+          </w:tcPr>
+          <w:p>
+            <w:pPr>
+              <w:spacing w:after="40"/>
+            </w:pPr>
+            <w:r>
+              <w:rPr>
+                <w:sz w:val="17"/>
+              </w:rPr>
+              <w:t>Vista aggregata calcolata, non persistita come dato master.</w:t>
+            </w:r>
+          </w:p>
+        </w:tc>
+        <w:tc>
+          <w:tcPr>
+            <w:tcW w:type="dxa" w:w="3456"/>
+            <w:vAlign w:val="center"/>
+          </w:tcPr>
+          <w:p>
+            <w:pPr>
+              <w:spacing w:after="40"/>
+            </w:pPr>
+            <w:r>
+              <w:rPr>
+                <w:sz w:val="17"/>
+              </w:rPr>
+              <w:t>Periodo, Agenzia e facoltativamente Partenza</w:t>
+            </w:r>
+          </w:p>
+        </w:tc>
+      </w:tr>
+      <w:tr>
+        <w:tc>
+          <w:tcPr>
+            <w:tcW w:type="dxa" w:w="1944"/>
+            <w:vAlign w:val="center"/>
+          </w:tcPr>
+          <w:p>
+            <w:pPr>
+              <w:spacing w:after="40"/>
+            </w:pPr>
+            <w:r>
+              <w:rPr>
+                <w:sz w:val="17"/>
+              </w:rPr>
+              <w:t>Feedback Tappa</w:t>
+            </w:r>
+          </w:p>
+        </w:tc>
+        <w:tc>
+          <w:tcPr>
+            <w:tcW w:type="dxa" w:w="3960"/>
+            <w:vAlign w:val="center"/>
+          </w:tcPr>
+          <w:p>
+            <w:pPr>
+              <w:spacing w:after="40"/>
+            </w:pPr>
+            <w:r>
+              <w:rPr>
+                <w:sz w:val="17"/>
+              </w:rPr>
+              <w:t>Valutazione gia presente, aggregata per giornata e attivita effettiva.</w:t>
+            </w:r>
+          </w:p>
+        </w:tc>
+        <w:tc>
+          <w:tcPr>
+            <w:tcW w:type="dxa" w:w="3456"/>
+            <w:vAlign w:val="center"/>
+          </w:tcPr>
+          <w:p>
+            <w:pPr>
+              <w:spacing w:after="40"/>
+            </w:pPr>
+            <w:r>
+              <w:rPr>
+                <w:sz w:val="17"/>
+              </w:rPr>
+              <w:t>Partenza, Giornata, Tappa, Viaggiatore</w:t>
+            </w:r>
+          </w:p>
+        </w:tc>
+      </w:tr>
+    </w:tbl>
+    <w:p/>
+    <w:p>
+      <w:pPr>
+        <w:pStyle w:val="Heading2"/>
+        <w:keepNext/>
+      </w:pPr>
+      <w:r>
+        <w:t>Semantica degli indicatori</w:t>
+      </w:r>
+    </w:p>
+    <w:tbl>
+      <w:tblPr>
+        <w:tblStyle w:val="TableGrid"/>
+        <w:tblW w:type="auto" w:w="0"/>
+        <w:tblLayout w:type="fixed"/>
+        <w:tblLook w:firstColumn="1" w:firstRow="1" w:lastColumn="0" w:lastRow="0" w:noHBand="0" w:noVBand="1" w:val="04A0"/>
+      </w:tblPr>
+      <w:tblGrid>
+        <w:gridCol w:w="4680"/>
+        <w:gridCol w:w="4680"/>
+      </w:tblGrid>
+      <w:tr>
+        <w:trPr>
+          <w:tblHeader/>
+        </w:trPr>
+        <w:tc>
+          <w:tcPr>
+            <w:tcW w:type="dxa" w:w="2520"/>
+            <w:vAlign w:val="center"/>
+          </w:tcPr>
+          <w:p>
+            <w:r>
+              <w:rPr>
+                <w:b/>
+                <w:sz w:val="18"/>
+              </w:rPr>
+              <w:t>Indicatore</w:t>
+            </w:r>
+          </w:p>
+        </w:tc>
+        <w:tc>
+          <w:tcPr>
+            <w:tcW w:type="dxa" w:w="6840"/>
+            <w:vAlign w:val="center"/>
+          </w:tcPr>
+          <w:p>
+            <w:r>
+              <w:rPr>
+                <w:b/>
+                <w:sz w:val="18"/>
+              </w:rPr>
+              <w:t>Definizione funzionale</w:t>
+            </w:r>
+          </w:p>
+        </w:tc>
+      </w:tr>
+      <w:tr>
+        <w:tc>
+          <w:tcPr>
+            <w:tcW w:type="dxa" w:w="2520"/>
+            <w:vAlign w:val="center"/>
+          </w:tcPr>
+          <w:p>
+            <w:pPr>
+              <w:spacing w:after="40"/>
+            </w:pPr>
+            <w:r>
+              <w:rPr>
+                <w:sz w:val="17"/>
+              </w:rPr>
+              <w:t>Invitati</w:t>
+            </w:r>
+          </w:p>
+        </w:tc>
+        <w:tc>
+          <w:tcPr>
+            <w:tcW w:type="dxa" w:w="6840"/>
+            <w:vAlign w:val="center"/>
+          </w:tcPr>
+          <w:p>
+            <w:pPr>
+              <w:spacing w:after="40"/>
+            </w:pPr>
+            <w:r>
+              <w:rPr>
+                <w:sz w:val="17"/>
+              </w:rPr>
+              <w:t>Viaggiatori associati a una partenza nel perimetro selezionato.</w:t>
+            </w:r>
+          </w:p>
+        </w:tc>
+      </w:tr>
+      <w:tr>
+        <w:tc>
+          <w:tcPr>
+            <w:tcW w:type="dxa" w:w="2520"/>
+            <w:vAlign w:val="center"/>
+          </w:tcPr>
+          <w:p>
+            <w:pPr>
+              <w:spacing w:after="40"/>
+            </w:pPr>
+            <w:r>
+              <w:rPr>
+                <w:sz w:val="17"/>
+              </w:rPr>
+              <w:t>Attivati</w:t>
+            </w:r>
+          </w:p>
+        </w:tc>
+        <w:tc>
+          <w:tcPr>
+            <w:tcW w:type="dxa" w:w="6840"/>
+            <w:vAlign w:val="center"/>
+          </w:tcPr>
+          <w:p>
+            <w:pPr>
+              <w:spacing w:after="40"/>
+            </w:pPr>
+            <w:r>
+              <w:rPr>
+                <w:sz w:val="17"/>
+              </w:rPr>
+              <w:t>Viaggiatori con identita digitale attiva.</w:t>
+            </w:r>
+          </w:p>
+        </w:tc>
+      </w:tr>
+      <w:tr>
+        <w:tc>
+          <w:tcPr>
+            <w:tcW w:type="dxa" w:w="2520"/>
+            <w:vAlign w:val="center"/>
+          </w:tcPr>
+          <w:p>
+            <w:pPr>
+              <w:spacing w:after="40"/>
+            </w:pPr>
+            <w:r>
+              <w:rPr>
+                <w:sz w:val="17"/>
+              </w:rPr>
+              <w:t>Attivi</w:t>
+            </w:r>
+          </w:p>
+        </w:tc>
+        <w:tc>
+          <w:tcPr>
+            <w:tcW w:type="dxa" w:w="6840"/>
+            <w:vAlign w:val="center"/>
+          </w:tcPr>
+          <w:p>
+            <w:pPr>
+              <w:spacing w:after="40"/>
+            </w:pPr>
+            <w:r>
+              <w:rPr>
+                <w:sz w:val="17"/>
+              </w:rPr>
+              <w:t>Viaggiatori distinti con almeno un evento Analytics nel periodo.</w:t>
+            </w:r>
+          </w:p>
+        </w:tc>
+      </w:tr>
+      <w:tr>
+        <w:tc>
+          <w:tcPr>
+            <w:tcW w:type="dxa" w:w="2520"/>
+            <w:vAlign w:val="center"/>
+          </w:tcPr>
+          <w:p>
+            <w:pPr>
+              <w:spacing w:after="40"/>
+            </w:pPr>
+            <w:r>
+              <w:rPr>
+                <w:sz w:val="17"/>
+              </w:rPr>
+              <w:t>Consultazioni programma</w:t>
+            </w:r>
+          </w:p>
+        </w:tc>
+        <w:tc>
+          <w:tcPr>
+            <w:tcW w:type="dxa" w:w="6840"/>
+            <w:vAlign w:val="center"/>
+          </w:tcPr>
+          <w:p>
+            <w:pPr>
+              <w:spacing w:after="40"/>
+            </w:pPr>
+            <w:r>
+              <w:rPr>
+                <w:sz w:val="17"/>
+              </w:rPr>
+              <w:t>Eventi programme_view validi e deduplicati.</w:t>
+            </w:r>
+          </w:p>
+        </w:tc>
+      </w:tr>
+      <w:tr>
+        <w:tc>
+          <w:tcPr>
+            <w:tcW w:type="dxa" w:w="2520"/>
+            <w:vAlign w:val="center"/>
+          </w:tcPr>
+          <w:p>
+            <w:pPr>
+              <w:spacing w:after="40"/>
+            </w:pPr>
+            <w:r>
+              <w:rPr>
+                <w:sz w:val="17"/>
+              </w:rPr>
+              <w:t>Uso documenti</w:t>
+            </w:r>
+          </w:p>
+        </w:tc>
+        <w:tc>
+          <w:tcPr>
+            <w:tcW w:type="dxa" w:w="6840"/>
+            <w:vAlign w:val="center"/>
+          </w:tcPr>
+          <w:p>
+            <w:pPr>
+              <w:spacing w:after="40"/>
+            </w:pPr>
+            <w:r>
+              <w:rPr>
+                <w:sz w:val="17"/>
+              </w:rPr>
+              <w:t>Viaggiatori distinti con almeno un document_download.</w:t>
+            </w:r>
+          </w:p>
+        </w:tc>
+      </w:tr>
+      <w:tr>
+        <w:tc>
+          <w:tcPr>
+            <w:tcW w:type="dxa" w:w="2520"/>
+            <w:vAlign w:val="center"/>
+          </w:tcPr>
+          <w:p>
+            <w:pPr>
+              <w:spacing w:after="40"/>
+            </w:pPr>
+            <w:r>
+              <w:rPr>
+                <w:sz w:val="17"/>
+              </w:rPr>
+              <w:t>Assistenza</w:t>
+            </w:r>
+          </w:p>
+        </w:tc>
+        <w:tc>
+          <w:tcPr>
+            <w:tcW w:type="dxa" w:w="6840"/>
+            <w:vAlign w:val="center"/>
+          </w:tcPr>
+          <w:p>
+            <w:pPr>
+              <w:spacing w:after="40"/>
+            </w:pPr>
+            <w:r>
+              <w:rPr>
+                <w:sz w:val="17"/>
+              </w:rPr>
+              <w:t>Messaggi inviati dai viaggiatori nella chat operativa.</w:t>
+            </w:r>
+          </w:p>
+        </w:tc>
+      </w:tr>
+      <w:tr>
+        <w:tc>
+          <w:tcPr>
+            <w:tcW w:type="dxa" w:w="2520"/>
+            <w:vAlign w:val="center"/>
+          </w:tcPr>
+          <w:p>
+            <w:pPr>
+              <w:spacing w:after="40"/>
+            </w:pPr>
+            <w:r>
+              <w:rPr>
+                <w:sz w:val="17"/>
+              </w:rPr>
+              <w:t>Engagement</w:t>
+            </w:r>
+          </w:p>
+        </w:tc>
+        <w:tc>
+          <w:tcPr>
+            <w:tcW w:type="dxa" w:w="6840"/>
+            <w:vAlign w:val="center"/>
+          </w:tcPr>
+          <w:p>
+            <w:pPr>
+              <w:spacing w:after="40"/>
+            </w:pPr>
+            <w:r>
+              <w:rPr>
+                <w:sz w:val="17"/>
+              </w:rPr>
+              <w:t>Tentativi quiz e sfide, oltre alle partecipazioni ai contest, completati nel periodo.</w:t>
+            </w:r>
+          </w:p>
+        </w:tc>
+      </w:tr>
+      <w:tr>
+        <w:tc>
+          <w:tcPr>
+            <w:tcW w:type="dxa" w:w="2520"/>
+            <w:vAlign w:val="center"/>
+          </w:tcPr>
+          <w:p>
+            <w:pPr>
+              <w:spacing w:after="40"/>
+            </w:pPr>
+            <w:r>
+              <w:rPr>
+                <w:sz w:val="17"/>
+              </w:rPr>
+              <w:t>Feedback per tappa</w:t>
+            </w:r>
+          </w:p>
+        </w:tc>
+        <w:tc>
+          <w:tcPr>
+            <w:tcW w:type="dxa" w:w="6840"/>
+            <w:vAlign w:val="center"/>
+          </w:tcPr>
+          <w:p>
+            <w:pPr>
+              <w:spacing w:after="40"/>
+            </w:pPr>
+            <w:r>
+              <w:rPr>
+                <w:sz w:val="17"/>
+              </w:rPr>
+              <w:t>Media, numerosita e ordinamento delle valutazioni per attivita effettiva.</w:t>
+            </w:r>
+          </w:p>
+        </w:tc>
+      </w:tr>
+    </w:tbl>
+    <w:p/>
+    <w:p>
+      <w:pPr>
+        <w:pStyle w:val="Heading2"/>
+        <w:keepNext/>
+      </w:pPr>
+      <w:r>
+        <w:t>Regole di business</w:t>
+      </w:r>
+    </w:p>
+    <w:p>
+      <w:pPr>
+        <w:pStyle w:val="ListBullet"/>
+      </w:pPr>
+      <w:r>
+        <w:t>Ogni evento appartiene a una sola agenzia, partenza e gruppo.</w:t>
+      </w:r>
+    </w:p>
+    <w:p>
+      <w:pPr>
+        <w:pStyle w:val="ListBullet"/>
+      </w:pPr>
+      <w:r>
+        <w:t>La giornata e opzionale per gli eventi generali e obbligatoriamente coerente con la partenza quando valorizzata.</w:t>
+      </w:r>
+    </w:p>
+    <w:p>
+      <w:pPr>
+        <w:pStyle w:val="ListBullet"/>
+      </w:pPr>
+      <w:r>
+        <w:t>La selezione di una partenza restringe tutti gli indicatori della pagina.</w:t>
+      </w:r>
+    </w:p>
+    <w:p>
+      <w:pPr>
+        <w:pStyle w:val="ListBullet"/>
+      </w:pPr>
+      <w:r>
+        <w:t>Le metriche storiche di consultazione decorrono dall'attivazione del tracking; feedback, chat ed engagement usano anche dati applicativi gia esistenti.</w:t>
       </w:r>
     </w:p>
     <w:sectPr>

</xml_diff>

<commit_message>
Complete use-case audit and runtime read contracts
</commit_message>
<xml_diff>
--- a/docs/data-model/SMF_Travel_Modello_Logico_Dati_v1.0.docx
+++ b/docs/data-model/SMF_Travel_Modello_Logico_Dati_v1.0.docx
@@ -11118,6 +11118,171 @@
       </w:pPr>
       <w:r>
         <w:t>Le metriche storiche di consultazione decorrono dall'attivazione del tracking; feedback, chat ed engagement usano anche dati applicativi gia esistenti.</w:t>
+      </w:r>
+    </w:p>
+    <w:p>
+      <w:r>
+        <w:br w:type="page"/>
+      </w:r>
+    </w:p>
+    <w:p>
+      <w:pPr>
+        <w:pStyle w:val="Heading1"/>
+      </w:pPr>
+      <w:r>
+        <w:t>Addendum 2026-08-30 - Governance KPI, variazioni, contenuti e onboarding</w:t>
+      </w:r>
+    </w:p>
+    <w:p>
+      <w:pPr>
+        <w:pStyle w:val="Heading2"/>
+      </w:pPr>
+      <w:r>
+        <w:t>Nuove entità logiche</w:t>
+      </w:r>
+    </w:p>
+    <w:p>
+      <w:pPr>
+        <w:pStyle w:val="ListBullet"/>
+      </w:pPr>
+      <w:r>
+        <w:t>Definizione KPI: identificata da codice e versione; descrive formula, numeratore, denominatore, eventi sorgente, frequenza ed efficacia temporale.</w:t>
+      </w:r>
+    </w:p>
+    <w:p>
+      <w:pPr>
+        <w:pStyle w:val="ListBullet"/>
+      </w:pPr>
+      <w:r>
+        <w:t>Comunicazione di variazione: appartiene a una agenzia e a una partenza; può riferirsi a una giornata o tappa e conserva precedente, corrente, autore, severità e data di pubblicazione.</w:t>
+      </w:r>
+    </w:p>
+    <w:p>
+      <w:pPr>
+        <w:pStyle w:val="ListBullet"/>
+      </w:pPr>
+      <w:r>
+        <w:t>Presa visione: associa una comunicazione a un viaggiatore; è unica per coppia comunicazione-viaggiatore e idempotente per operazione client.</w:t>
+      </w:r>
+    </w:p>
+    <w:p>
+      <w:pPr>
+        <w:pStyle w:val="ListBullet"/>
+      </w:pPr>
+      <w:r>
+        <w:t>Governance informazione utile: estende il contenuto con fonte, URL, acquisizione, verifica, scadenza, stato di revisione, revisore e disclaimer.</w:t>
+      </w:r>
+    </w:p>
+    <w:p>
+      <w:pPr>
+        <w:pStyle w:val="ListBullet"/>
+      </w:pPr>
+      <w:r>
+        <w:t>Invito personale: resta associato a un solo utente e username; più inviti possono condividere la stessa email senza dipendenze reciproche.</w:t>
+      </w:r>
+    </w:p>
+    <w:p>
+      <w:pPr>
+        <w:pStyle w:val="Heading2"/>
+      </w:pPr>
+      <w:r>
+        <w:t>Relazioni e cardinalità</w:t>
+      </w:r>
+    </w:p>
+    <w:p>
+      <w:pPr>
+        <w:pStyle w:val="ListBullet"/>
+      </w:pPr>
+      <w:r>
+        <w:t>Agenzia 1:N Comunicazioni; Partenza 1:N Comunicazioni; Giornata 0..1:N Comunicazioni; Tappa 0..1:N Comunicazioni.</w:t>
+      </w:r>
+    </w:p>
+    <w:p>
+      <w:pPr>
+        <w:pStyle w:val="ListBullet"/>
+      </w:pPr>
+      <w:r>
+        <w:t>Comunicazione N:M Viaggiatore tramite Presa visione; l'accesso è ammesso solo se esiste una membership attiva nella partenza.</w:t>
+      </w:r>
+    </w:p>
+    <w:p>
+      <w:pPr>
+        <w:pStyle w:val="ListBullet"/>
+      </w:pPr>
+      <w:r>
+        <w:t>Versione programma 1:N Informazioni utili; ciascuna informazione possiede esattamente uno stato di revisione corrente.</w:t>
+      </w:r>
+    </w:p>
+    <w:p>
+      <w:pPr>
+        <w:pStyle w:val="ListBullet"/>
+      </w:pPr>
+      <w:r>
+        <w:t>Definizione KPI 1:N versioni temporali, con una sola versione efficace per codice in un istante logico.</w:t>
+      </w:r>
+    </w:p>
+    <w:p>
+      <w:pPr>
+        <w:pStyle w:val="ListBullet"/>
+      </w:pPr>
+      <w:r>
+        <w:t>Utente 1:N Inviti storici, ma ogni token attivo è personale, monouso e riferito a un solo utente.</w:t>
+      </w:r>
+    </w:p>
+    <w:p>
+      <w:pPr>
+        <w:pStyle w:val="Heading2"/>
+      </w:pPr>
+      <w:r>
+        <w:t>Regole di business aggiunte</w:t>
+      </w:r>
+    </w:p>
+    <w:p>
+      <w:pPr>
+        <w:pStyle w:val="ListBullet"/>
+      </w:pPr>
+      <w:r>
+        <w:t>BR-ANA-01: adozione = viaggiatori con sessione significativa / viaggiatori abilitati, non / account attivati.</w:t>
+      </w:r>
+    </w:p>
+    <w:p>
+      <w:pPr>
+        <w:pStyle w:val="ListBullet"/>
+      </w:pPr>
+      <w:r>
+        <w:t>BR-ANA-02: refresh tecnici, impersonificazioni e membership rimosse non concorrono ai KPI commerciali.</w:t>
+      </w:r>
+    </w:p>
+    <w:p>
+      <w:pPr>
+        <w:pStyle w:val="ListBullet"/>
+      </w:pPr>
+      <w:r>
+        <w:t>BR-CHG-01: ogni modifica pubblicata al programma genera una comunicazione leggibile; l'audit tecnico non la sostituisce.</w:t>
+      </w:r>
+    </w:p>
+    <w:p>
+      <w:pPr>
+        <w:pStyle w:val="ListBullet"/>
+      </w:pPr>
+      <w:r>
+        <w:t>BR-CNT-01: salute, sicurezza, documenti, emergenze e ambasciata scadono dopo 7 giorni salvo regola più restrittiva; contenuti non sensibili dopo 90 giorni.</w:t>
+      </w:r>
+    </w:p>
+    <w:p>
+      <w:pPr>
+        <w:pStyle w:val="ListBullet"/>
+      </w:pPr>
+      <w:r>
+        <w:t>BR-CNT-02: la generazione AI produce needs_review; solo un revisore autorizzato può impostare approved.</w:t>
+      </w:r>
+    </w:p>
+    <w:p>
+      <w:pPr>
+        <w:pStyle w:val="ListBullet"/>
+      </w:pPr>
+      <w:r>
+        <w:t>BR-IAM-01: l'email è un recapito, lo username è l'identificatore di accesso; il consumo di un invito non invalida quelli associati ad altri utenti.</w:t>
       </w:r>
     </w:p>
     <w:sectPr>

</xml_diff>